<commit_message>
Weeks 3-4 task: hand in twice, Part C after section 5
CSS, XPath and assertEquals move to the start of section 5, so Part C is
due before section 6. Parts A and B are still due before section 5.
</commit_message>
<xml_diff>
--- a/week-04/Weeks 3-4 - Lab Sheet.docx
+++ b/week-04/Weeks 3-4 - Lab Sheet.docx
@@ -163,9 +163,188 @@
           <w:i w:val="0"/>
           <w:sz w:val="20"/>
         </w:rPr>
-        <w:t>One task for weeks 3 and 4, done on your own laptop. Part A needs only a browser. Parts B and C need your own Maven project. Hand in on the form before section 5: this sheet, ShopVisit.java, ShopCheck.java, and one screenshot of a run. At the start of section 5 you will run Parts B and C in front of the TA.</w:t>
+        <w:t>One task for weeks 3 and 4, done on your own laptop. Part A needs only a browser. Parts B and C need your own Maven project. You hand it in twice, on the form:</w:t>
       </w:r>
     </w:p>
+    <w:tbl>
+      <w:tblPr>
+        <w:tblW w:type="auto" w:w="0"/>
+        <w:jc w:val="center"/>
+        <w:tblLayout w:type="fixed"/>
+        <w:tblLook w:firstColumn="1" w:firstRow="1" w:lastColumn="0" w:lastRow="0" w:noHBand="0" w:noVBand="1" w:val="04A0"/>
+        <w:tblBorders>
+          <w:top w:val="single" w:sz="4" w:space="0" w:color="BFC7CC"/>
+          <w:left w:val="single" w:sz="4" w:space="0" w:color="BFC7CC"/>
+          <w:bottom w:val="single" w:sz="4" w:space="0" w:color="BFC7CC"/>
+          <w:right w:val="single" w:sz="4" w:space="0" w:color="BFC7CC"/>
+          <w:insideH w:val="single" w:sz="4" w:space="0" w:color="BFC7CC"/>
+          <w:insideV w:val="single" w:sz="4" w:space="0" w:color="BFC7CC"/>
+        </w:tblBorders>
+      </w:tblPr>
+      <w:tblGrid>
+        <w:gridCol w:w="3250"/>
+        <w:gridCol w:w="3250"/>
+        <w:gridCol w:w="3250"/>
+      </w:tblGrid>
+      <w:tr>
+        <w:trPr>
+          <w:cantSplit/>
+        </w:trPr>
+        <w:tc>
+          <w:tcPr>
+            <w:tcW w:type="dxa" w:w="1872"/>
+            <w:shd w:val="clear" w:color="auto" w:fill="2A3A42"/>
+          </w:tcPr>
+          <w:p>
+            <w:pPr>
+              <w:keepNext/>
+            </w:pPr>
+            <w:r>
+              <w:rPr>
+                <w:b/>
+                <w:color w:val="FFFFFF"/>
+                <w:sz w:val="20"/>
+              </w:rPr>
+            </w:r>
+          </w:p>
+        </w:tc>
+        <w:tc>
+          <w:tcPr>
+            <w:tcW w:type="dxa" w:w="3960"/>
+            <w:shd w:val="clear" w:color="auto" w:fill="2A3A42"/>
+          </w:tcPr>
+          <w:p>
+            <w:pPr>
+              <w:keepNext/>
+            </w:pPr>
+            <w:r>
+              <w:rPr>
+                <w:b/>
+                <w:color w:val="FFFFFF"/>
+                <w:sz w:val="20"/>
+              </w:rPr>
+              <w:t>Hand in</w:t>
+            </w:r>
+          </w:p>
+        </w:tc>
+        <w:tc>
+          <w:tcPr>
+            <w:tcW w:type="dxa" w:w="3888"/>
+            <w:shd w:val="clear" w:color="auto" w:fill="2A3A42"/>
+          </w:tcPr>
+          <w:p>
+            <w:pPr>
+              <w:keepNext/>
+            </w:pPr>
+            <w:r>
+              <w:rPr>
+                <w:b/>
+                <w:color w:val="FFFFFF"/>
+                <w:sz w:val="20"/>
+              </w:rPr>
+              <w:t>When</w:t>
+            </w:r>
+          </w:p>
+        </w:tc>
+      </w:tr>
+      <w:tr>
+        <w:trPr>
+          <w:cantSplit/>
+        </w:trPr>
+        <w:tc>
+          <w:tcPr>
+            <w:tcW w:type="dxa" w:w="1872"/>
+          </w:tcPr>
+          <w:p>
+            <w:pPr>
+              <w:keepNext/>
+            </w:pPr>
+            <w:r>
+              <w:rPr>
+                <w:sz w:val="20"/>
+              </w:rPr>
+              <w:t>Parts A and B</w:t>
+            </w:r>
+          </w:p>
+        </w:tc>
+        <w:tc>
+          <w:tcPr>
+            <w:tcW w:type="dxa" w:w="3960"/>
+          </w:tcPr>
+          <w:p>
+            <w:pPr>
+              <w:keepNext/>
+            </w:pPr>
+            <w:r>
+              <w:rPr>
+                <w:sz w:val="20"/>
+              </w:rPr>
+              <w:t>This sheet with Parts A and B, ShopVisit.java, one screenshot of a run</w:t>
+            </w:r>
+          </w:p>
+        </w:tc>
+        <w:tc>
+          <w:tcPr>
+            <w:tcW w:type="dxa" w:w="3888"/>
+          </w:tcPr>
+          <w:p>
+            <w:pPr>
+              <w:keepNext/>
+            </w:pPr>
+            <w:r>
+              <w:rPr>
+                <w:sz w:val="20"/>
+              </w:rPr>
+              <w:t>Before section 5. Run Part B in front of the TA at the start of section 5.</w:t>
+            </w:r>
+          </w:p>
+        </w:tc>
+      </w:tr>
+      <w:tr>
+        <w:trPr>
+          <w:cantSplit/>
+        </w:trPr>
+        <w:tc>
+          <w:tcPr>
+            <w:tcW w:type="dxa" w:w="1872"/>
+          </w:tcPr>
+          <w:p>
+            <w:r>
+              <w:rPr>
+                <w:sz w:val="20"/>
+              </w:rPr>
+              <w:t>Part C</w:t>
+            </w:r>
+          </w:p>
+        </w:tc>
+        <w:tc>
+          <w:tcPr>
+            <w:tcW w:type="dxa" w:w="3960"/>
+          </w:tcPr>
+          <w:p>
+            <w:r>
+              <w:rPr>
+                <w:sz w:val="20"/>
+              </w:rPr>
+              <w:t>This sheet with Part C, ShopCheck.java, one screenshot of a run</w:t>
+            </w:r>
+          </w:p>
+        </w:tc>
+        <w:tc>
+          <w:tcPr>
+            <w:tcW w:type="dxa" w:w="3888"/>
+          </w:tcPr>
+          <w:p>
+            <w:r>
+              <w:rPr>
+                <w:sz w:val="20"/>
+              </w:rPr>
+              <w:t>Section 5 explains CSS, XPath and assertEquals. Hand in before section 6 and run it in front of the TA at the start of section 6.</w:t>
+            </w:r>
+          </w:p>
+        </w:tc>
+      </w:tr>
+    </w:tbl>
     <w:p>
       <w:pPr>
         <w:keepNext/>
@@ -3389,6 +3568,19 @@
     </w:p>
     <w:p>
       <w:pPr>
+        <w:keepNext/>
+      </w:pPr>
+      <w:r>
+        <w:rPr>
+          <w:b/>
+          <w:i w:val="0"/>
+          <w:sz w:val="20"/>
+        </w:rPr>
+        <w:t>Do this part after section 5. Hand it in before section 6.</w:t>
+      </w:r>
+    </w:p>
+    <w:p>
+      <w:pPr>
         <w:pStyle w:val="Heading2"/>
         <w:keepNext/>
       </w:pPr>
@@ -3409,7 +3601,7 @@
           <w:i/>
           <w:sz w:val="18"/>
         </w:rPr>
-        <w:t>Section 4 · slides 5 to 13</w:t>
+        <w:t>Sections 4 and 5 · slides 5 to 13</w:t>
       </w:r>
     </w:p>
     <w:p>
@@ -4047,7 +4239,7 @@
           <w:i/>
           <w:sz w:val="18"/>
         </w:rPr>
-        <w:t>Section 4 · slides 14 to 21</w:t>
+        <w:t>Section 5 · slides 14 to 21</w:t>
       </w:r>
     </w:p>
     <w:p>

</xml_diff>

<commit_message>
Weeks 3-4 task: Part C automates an order to the PDF, code goes in java-task
The sheet drops the hand-in table, the own-project exercise, the three
experiments and ShopCheck. Part C is now six locators and ShopOrder.
</commit_message>
<xml_diff>
--- a/week-04/Weeks 3-4 - Lab Sheet.docx
+++ b/week-04/Weeks 3-4 - Lab Sheet.docx
@@ -51,7 +51,7 @@
           <w:b w:val="0"/>
           <w:sz w:val="20"/>
         </w:rPr>
-        <w:t>Weeks 3–4: Defect Reports, First Selenium Script, Locators and Assertions</w:t>
+        <w:t>Weeks 3–4: Defect Reports, First Selenium Script and Locators</w:t>
       </w:r>
     </w:p>
     <w:tbl>
@@ -163,188 +163,9 @@
           <w:i w:val="0"/>
           <w:sz w:val="20"/>
         </w:rPr>
-        <w:t>One task for weeks 3 and 4, done on your own laptop. Part A needs only a browser. Parts B and C need your own Maven project. You hand it in twice, on the form:</w:t>
+        <w:t>One task for weeks 3 and 4. Part A needs only a browser. Parts B and C are code: write them in the java-task project from the course repo (the java-task branch).</w:t>
       </w:r>
     </w:p>
-    <w:tbl>
-      <w:tblPr>
-        <w:tblW w:type="auto" w:w="0"/>
-        <w:jc w:val="center"/>
-        <w:tblLayout w:type="fixed"/>
-        <w:tblLook w:firstColumn="1" w:firstRow="1" w:lastColumn="0" w:lastRow="0" w:noHBand="0" w:noVBand="1" w:val="04A0"/>
-        <w:tblBorders>
-          <w:top w:val="single" w:sz="4" w:space="0" w:color="BFC7CC"/>
-          <w:left w:val="single" w:sz="4" w:space="0" w:color="BFC7CC"/>
-          <w:bottom w:val="single" w:sz="4" w:space="0" w:color="BFC7CC"/>
-          <w:right w:val="single" w:sz="4" w:space="0" w:color="BFC7CC"/>
-          <w:insideH w:val="single" w:sz="4" w:space="0" w:color="BFC7CC"/>
-          <w:insideV w:val="single" w:sz="4" w:space="0" w:color="BFC7CC"/>
-        </w:tblBorders>
-      </w:tblPr>
-      <w:tblGrid>
-        <w:gridCol w:w="3250"/>
-        <w:gridCol w:w="3250"/>
-        <w:gridCol w:w="3250"/>
-      </w:tblGrid>
-      <w:tr>
-        <w:trPr>
-          <w:cantSplit/>
-        </w:trPr>
-        <w:tc>
-          <w:tcPr>
-            <w:tcW w:type="dxa" w:w="1872"/>
-            <w:shd w:val="clear" w:color="auto" w:fill="2A3A42"/>
-          </w:tcPr>
-          <w:p>
-            <w:pPr>
-              <w:keepNext/>
-            </w:pPr>
-            <w:r>
-              <w:rPr>
-                <w:b/>
-                <w:color w:val="FFFFFF"/>
-                <w:sz w:val="20"/>
-              </w:rPr>
-            </w:r>
-          </w:p>
-        </w:tc>
-        <w:tc>
-          <w:tcPr>
-            <w:tcW w:type="dxa" w:w="3960"/>
-            <w:shd w:val="clear" w:color="auto" w:fill="2A3A42"/>
-          </w:tcPr>
-          <w:p>
-            <w:pPr>
-              <w:keepNext/>
-            </w:pPr>
-            <w:r>
-              <w:rPr>
-                <w:b/>
-                <w:color w:val="FFFFFF"/>
-                <w:sz w:val="20"/>
-              </w:rPr>
-              <w:t>Hand in</w:t>
-            </w:r>
-          </w:p>
-        </w:tc>
-        <w:tc>
-          <w:tcPr>
-            <w:tcW w:type="dxa" w:w="3888"/>
-            <w:shd w:val="clear" w:color="auto" w:fill="2A3A42"/>
-          </w:tcPr>
-          <w:p>
-            <w:pPr>
-              <w:keepNext/>
-            </w:pPr>
-            <w:r>
-              <w:rPr>
-                <w:b/>
-                <w:color w:val="FFFFFF"/>
-                <w:sz w:val="20"/>
-              </w:rPr>
-              <w:t>When</w:t>
-            </w:r>
-          </w:p>
-        </w:tc>
-      </w:tr>
-      <w:tr>
-        <w:trPr>
-          <w:cantSplit/>
-        </w:trPr>
-        <w:tc>
-          <w:tcPr>
-            <w:tcW w:type="dxa" w:w="1872"/>
-          </w:tcPr>
-          <w:p>
-            <w:pPr>
-              <w:keepNext/>
-            </w:pPr>
-            <w:r>
-              <w:rPr>
-                <w:sz w:val="20"/>
-              </w:rPr>
-              <w:t>Parts A and B</w:t>
-            </w:r>
-          </w:p>
-        </w:tc>
-        <w:tc>
-          <w:tcPr>
-            <w:tcW w:type="dxa" w:w="3960"/>
-          </w:tcPr>
-          <w:p>
-            <w:pPr>
-              <w:keepNext/>
-            </w:pPr>
-            <w:r>
-              <w:rPr>
-                <w:sz w:val="20"/>
-              </w:rPr>
-              <w:t>This sheet with Parts A and B, ShopVisit.java, one screenshot of a run</w:t>
-            </w:r>
-          </w:p>
-        </w:tc>
-        <w:tc>
-          <w:tcPr>
-            <w:tcW w:type="dxa" w:w="3888"/>
-          </w:tcPr>
-          <w:p>
-            <w:pPr>
-              <w:keepNext/>
-            </w:pPr>
-            <w:r>
-              <w:rPr>
-                <w:sz w:val="20"/>
-              </w:rPr>
-              <w:t>Before section 5. Run Part B in front of the TA at the start of section 5.</w:t>
-            </w:r>
-          </w:p>
-        </w:tc>
-      </w:tr>
-      <w:tr>
-        <w:trPr>
-          <w:cantSplit/>
-        </w:trPr>
-        <w:tc>
-          <w:tcPr>
-            <w:tcW w:type="dxa" w:w="1872"/>
-          </w:tcPr>
-          <w:p>
-            <w:r>
-              <w:rPr>
-                <w:sz w:val="20"/>
-              </w:rPr>
-              <w:t>Part C</w:t>
-            </w:r>
-          </w:p>
-        </w:tc>
-        <w:tc>
-          <w:tcPr>
-            <w:tcW w:type="dxa" w:w="3960"/>
-          </w:tcPr>
-          <w:p>
-            <w:r>
-              <w:rPr>
-                <w:sz w:val="20"/>
-              </w:rPr>
-              <w:t>This sheet with Part C, ShopCheck.java, one screenshot of a run</w:t>
-            </w:r>
-          </w:p>
-        </w:tc>
-        <w:tc>
-          <w:tcPr>
-            <w:tcW w:type="dxa" w:w="3888"/>
-          </w:tcPr>
-          <w:p>
-            <w:r>
-              <w:rPr>
-                <w:sz w:val="20"/>
-              </w:rPr>
-              <w:t>Section 5 explains CSS, XPath and assertEquals. Hand in before section 6 and run it in front of the TA at the start of section 6.</w:t>
-            </w:r>
-          </w:p>
-        </w:tc>
-      </w:tr>
-    </w:tbl>
     <w:p>
       <w:pPr>
         <w:keepNext/>
@@ -2359,7 +2180,7 @@
           <w:i w:val="0"/>
           <w:sz w:val="26"/>
         </w:rPr>
-        <w:t>Part B: Automate it</w:t>
+        <w:t>Part B: Automate the browser</w:t>
       </w:r>
     </w:p>
     <w:p>
@@ -2371,176 +2192,7 @@
         <w:rPr>
           <w:b/>
         </w:rPr>
-        <w:t>Exercise 5: Your own project</w:t>
-      </w:r>
-    </w:p>
-    <w:p>
-      <w:pPr>
-        <w:keepNext/>
-      </w:pPr>
-      <w:r>
-        <w:rPr>
-          <w:b w:val="0"/>
-          <w:i/>
-          <w:sz w:val="18"/>
-        </w:rPr>
-        <w:t>Section 3 · slides 26 and 27</w:t>
-      </w:r>
-    </w:p>
-    <w:p>
-      <w:pPr>
-        <w:keepNext/>
-      </w:pPr>
-      <w:r>
-        <w:rPr>
-          <w:b w:val="0"/>
-          <w:i w:val="0"/>
-          <w:sz w:val="20"/>
-        </w:rPr>
-        <w:t>Create your own Maven project in IntelliJ (File › New › Project › Java, Build system: Maven). Add the Selenium and TestNG dependencies to pom.xml and reload Maven. Then write FirstProject from the section and run it.</w:t>
-      </w:r>
-    </w:p>
-    <w:tbl>
-      <w:tblPr>
-        <w:tblW w:type="auto" w:w="0"/>
-        <w:jc w:val="center"/>
-        <w:tblLayout w:type="fixed"/>
-        <w:tblLook w:firstColumn="1" w:firstRow="1" w:lastColumn="0" w:lastRow="0" w:noHBand="0" w:noVBand="1" w:val="04A0"/>
-        <w:tblBorders>
-          <w:top w:val="single" w:sz="4" w:space="0" w:color="BFC7CC"/>
-          <w:left w:val="single" w:sz="4" w:space="0" w:color="BFC7CC"/>
-          <w:bottom w:val="single" w:sz="4" w:space="0" w:color="BFC7CC"/>
-          <w:right w:val="single" w:sz="4" w:space="0" w:color="BFC7CC"/>
-          <w:insideH w:val="single" w:sz="4" w:space="0" w:color="BFC7CC"/>
-          <w:insideV w:val="single" w:sz="4" w:space="0" w:color="BFC7CC"/>
-        </w:tblBorders>
-      </w:tblPr>
-      <w:tblGrid>
-        <w:gridCol w:w="3250"/>
-        <w:gridCol w:w="3250"/>
-        <w:gridCol w:w="3250"/>
-      </w:tblGrid>
-      <w:tr>
-        <w:trPr>
-          <w:cantSplit/>
-        </w:trPr>
-        <w:tc>
-          <w:tcPr>
-            <w:tcW w:type="dxa" w:w="2880"/>
-            <w:shd w:val="clear" w:color="auto" w:fill="2A3A42"/>
-          </w:tcPr>
-          <w:p>
-            <w:pPr>
-              <w:keepNext/>
-            </w:pPr>
-            <w:r>
-              <w:rPr>
-                <w:b/>
-                <w:color w:val="FFFFFF"/>
-                <w:sz w:val="20"/>
-              </w:rPr>
-              <w:t>Your Java version</w:t>
-            </w:r>
-          </w:p>
-        </w:tc>
-        <w:tc>
-          <w:tcPr>
-            <w:tcW w:type="dxa" w:w="3600"/>
-            <w:shd w:val="clear" w:color="auto" w:fill="2A3A42"/>
-          </w:tcPr>
-          <w:p>
-            <w:pPr>
-              <w:keepNext/>
-            </w:pPr>
-            <w:r>
-              <w:rPr>
-                <w:b/>
-                <w:color w:val="FFFFFF"/>
-                <w:sz w:val="20"/>
-              </w:rPr>
-              <w:t>Selenium version in External Libraries</w:t>
-            </w:r>
-          </w:p>
-        </w:tc>
-        <w:tc>
-          <w:tcPr>
-            <w:tcW w:type="dxa" w:w="3240"/>
-            <w:shd w:val="clear" w:color="auto" w:fill="2A3A42"/>
-          </w:tcPr>
-          <w:p>
-            <w:pPr>
-              <w:keepNext/>
-            </w:pPr>
-            <w:r>
-              <w:rPr>
-                <w:b/>
-                <w:color w:val="FFFFFF"/>
-                <w:sz w:val="20"/>
-              </w:rPr>
-              <w:t>What did FirstProject print?</w:t>
-            </w:r>
-          </w:p>
-        </w:tc>
-      </w:tr>
-      <w:tr>
-        <w:trPr>
-          <w:cantSplit/>
-        </w:trPr>
-        <w:tc>
-          <w:tcPr>
-            <w:tcW w:type="dxa" w:w="2880"/>
-          </w:tcPr>
-          <w:p>
-            <w:r>
-              <w:rPr>
-                <w:sz w:val="20"/>
-              </w:rPr>
-            </w:r>
-          </w:p>
-          <w:p>
-            <w:r>
-              <w:rPr>
-                <w:sz w:val="20"/>
-              </w:rPr>
-            </w:r>
-          </w:p>
-        </w:tc>
-        <w:tc>
-          <w:tcPr>
-            <w:tcW w:type="dxa" w:w="3600"/>
-          </w:tcPr>
-          <w:p>
-            <w:r>
-              <w:rPr>
-                <w:sz w:val="20"/>
-              </w:rPr>
-            </w:r>
-          </w:p>
-        </w:tc>
-        <w:tc>
-          <w:tcPr>
-            <w:tcW w:type="dxa" w:w="3240"/>
-          </w:tcPr>
-          <w:p>
-            <w:r>
-              <w:rPr>
-                <w:sz w:val="20"/>
-              </w:rPr>
-            </w:r>
-          </w:p>
-        </w:tc>
-      </w:tr>
-    </w:tbl>
-    <w:p>
-      <w:pPr>
-        <w:pStyle w:val="Heading2"/>
-        <w:keepNext/>
-      </w:pPr>
-      <w:r>
-        <w:rPr>
-          <w:b/>
-        </w:rPr>
-        <w:t>Exercise 6: Write ShopVisit</w:t>
+        <w:t>Exercise 5: Write ShopVisit</w:t>
       </w:r>
     </w:p>
     <w:p>
@@ -2566,7 +2218,7 @@
           <w:i w:val="0"/>
           <w:sz w:val="20"/>
         </w:rPr>
-        <w:t>In the same project, write a class called ShopVisit with these six methods. Use only what we used in the section.</w:t>
+        <w:t>In the java-task project, write a class called ShopVisit with these six methods. Use only what we used in the section.</w:t>
       </w:r>
     </w:p>
     <w:tbl>
@@ -2699,7 +2351,7 @@
               <w:rPr>
                 <w:sz w:val="20"/>
               </w:rPr>
-              <w:t>Opens Chrome.</w:t>
+              <w:t>Opens Chrome: driver = Setup.chrome();</w:t>
             </w:r>
           </w:p>
         </w:tc>
@@ -2858,7 +2510,7 @@
               <w:rPr>
                 <w:sz w:val="20"/>
               </w:rPr>
-              <w:t>Makes the window phone size (390 × 844), then tablet size (1366 × 1024), then maximizes it. Wait two seconds between the steps so you can see them.</w:t>
+              <w:t>Makes the window phone size (390 × 844), then tablet size (1366 × 1024), then maximizes it. Call Setup.pause() between the steps so you can see them.</w:t>
             </w:r>
           </w:p>
         </w:tc>
@@ -3213,6 +2865,19 @@
     </w:tbl>
     <w:p>
       <w:pPr>
+        <w:keepNext/>
+      </w:pPr>
+      <w:r>
+        <w:rPr>
+          <w:b/>
+          <w:i w:val="0"/>
+          <w:sz w:val="26"/>
+        </w:rPr>
+        <w:t>Part C: Find it and automate it</w:t>
+      </w:r>
+    </w:p>
+    <w:p>
+      <w:pPr>
         <w:pStyle w:val="Heading2"/>
         <w:keepNext/>
       </w:pPr>
@@ -3220,7 +2885,7 @@
         <w:rPr>
           <w:b/>
         </w:rPr>
-        <w:t>Exercise 7: Change it and watch</w:t>
+        <w:t>Exercise 6: Write the locators</w:t>
       </w:r>
     </w:p>
     <w:p>
@@ -3233,375 +2898,7 @@
           <w:i/>
           <w:sz w:val="18"/>
         </w:rPr>
-        <w:t>Section 3 · slides 29 and 31</w:t>
-      </w:r>
-    </w:p>
-    <w:p>
-      <w:pPr>
-        <w:keepNext/>
-      </w:pPr>
-      <w:r>
-        <w:rPr>
-          <w:b w:val="0"/>
-          <w:i w:val="0"/>
-          <w:sz w:val="20"/>
-        </w:rPr>
-        <w:t>Make each change, run ShopVisit, write what you saw, then undo the change before the next one.</w:t>
-      </w:r>
-    </w:p>
-    <w:tbl>
-      <w:tblPr>
-        <w:tblW w:type="auto" w:w="0"/>
-        <w:jc w:val="center"/>
-        <w:tblLayout w:type="fixed"/>
-        <w:tblLook w:firstColumn="1" w:firstRow="1" w:lastColumn="0" w:lastRow="0" w:noHBand="0" w:noVBand="1" w:val="04A0"/>
-        <w:tblBorders>
-          <w:top w:val="single" w:sz="4" w:space="0" w:color="BFC7CC"/>
-          <w:left w:val="single" w:sz="4" w:space="0" w:color="BFC7CC"/>
-          <w:bottom w:val="single" w:sz="4" w:space="0" w:color="BFC7CC"/>
-          <w:right w:val="single" w:sz="4" w:space="0" w:color="BFC7CC"/>
-          <w:insideH w:val="single" w:sz="4" w:space="0" w:color="BFC7CC"/>
-          <w:insideV w:val="single" w:sz="4" w:space="0" w:color="BFC7CC"/>
-        </w:tblBorders>
-      </w:tblPr>
-      <w:tblGrid>
-        <w:gridCol w:w="3250"/>
-        <w:gridCol w:w="3250"/>
-        <w:gridCol w:w="3250"/>
-      </w:tblGrid>
-      <w:tr>
-        <w:trPr>
-          <w:cantSplit/>
-        </w:trPr>
-        <w:tc>
-          <w:tcPr>
-            <w:tcW w:type="dxa" w:w="576"/>
-            <w:shd w:val="clear" w:color="auto" w:fill="2A3A42"/>
-          </w:tcPr>
-          <w:p>
-            <w:pPr>
-              <w:keepNext/>
-            </w:pPr>
-            <w:r>
-              <w:rPr>
-                <w:b/>
-                <w:color w:val="FFFFFF"/>
-                <w:sz w:val="20"/>
-              </w:rPr>
-              <w:t>#</w:t>
-            </w:r>
-          </w:p>
-        </w:tc>
-        <w:tc>
-          <w:tcPr>
-            <w:tcW w:type="dxa" w:w="4320"/>
-            <w:shd w:val="clear" w:color="auto" w:fill="2A3A42"/>
-          </w:tcPr>
-          <w:p>
-            <w:pPr>
-              <w:keepNext/>
-            </w:pPr>
-            <w:r>
-              <w:rPr>
-                <w:b/>
-                <w:color w:val="FFFFFF"/>
-                <w:sz w:val="20"/>
-              </w:rPr>
-              <w:t>Change</w:t>
-            </w:r>
-          </w:p>
-        </w:tc>
-        <w:tc>
-          <w:tcPr>
-            <w:tcW w:type="dxa" w:w="4824"/>
-            <w:shd w:val="clear" w:color="auto" w:fill="2A3A42"/>
-          </w:tcPr>
-          <w:p>
-            <w:pPr>
-              <w:keepNext/>
-            </w:pPr>
-            <w:r>
-              <w:rPr>
-                <w:b/>
-                <w:color w:val="FFFFFF"/>
-                <w:sz w:val="20"/>
-              </w:rPr>
-              <w:t>What did you see, and why?</w:t>
-            </w:r>
-          </w:p>
-        </w:tc>
-      </w:tr>
-      <w:tr>
-        <w:trPr>
-          <w:cantSplit/>
-        </w:trPr>
-        <w:tc>
-          <w:tcPr>
-            <w:tcW w:type="dxa" w:w="576"/>
-          </w:tcPr>
-          <w:p>
-            <w:pPr>
-              <w:keepNext/>
-            </w:pPr>
-            <w:r>
-              <w:rPr>
-                <w:sz w:val="20"/>
-              </w:rPr>
-              <w:t>a</w:t>
-            </w:r>
-          </w:p>
-        </w:tc>
-        <w:tc>
-          <w:tcPr>
-            <w:tcW w:type="dxa" w:w="4320"/>
-          </w:tcPr>
-          <w:p>
-            <w:pPr>
-              <w:keepNext/>
-            </w:pPr>
-            <w:r>
-              <w:rPr>
-                <w:sz w:val="20"/>
-              </w:rPr>
-              <w:t>Swap the priorities of openShop and goAndBack (1 and 2). What does the title after going back print now?</w:t>
-            </w:r>
-          </w:p>
-        </w:tc>
-        <w:tc>
-          <w:tcPr>
-            <w:tcW w:type="dxa" w:w="4824"/>
-          </w:tcPr>
-          <w:p>
-            <w:pPr>
-              <w:keepNext/>
-            </w:pPr>
-            <w:r>
-              <w:rPr>
-                <w:sz w:val="20"/>
-              </w:rPr>
-            </w:r>
-          </w:p>
-          <w:p>
-            <w:pPr>
-              <w:keepNext/>
-            </w:pPr>
-            <w:r>
-              <w:rPr>
-                <w:sz w:val="20"/>
-              </w:rPr>
-            </w:r>
-          </w:p>
-          <w:p>
-            <w:pPr>
-              <w:keepNext/>
-            </w:pPr>
-            <w:r>
-              <w:rPr>
-                <w:sz w:val="20"/>
-              </w:rPr>
-            </w:r>
-          </w:p>
-          <w:p>
-            <w:pPr>
-              <w:keepNext/>
-            </w:pPr>
-            <w:r>
-              <w:rPr>
-                <w:sz w:val="20"/>
-              </w:rPr>
-            </w:r>
-          </w:p>
-        </w:tc>
-      </w:tr>
-      <w:tr>
-        <w:trPr>
-          <w:cantSplit/>
-        </w:trPr>
-        <w:tc>
-          <w:tcPr>
-            <w:tcW w:type="dxa" w:w="576"/>
-          </w:tcPr>
-          <w:p>
-            <w:pPr>
-              <w:keepNext/>
-            </w:pPr>
-            <w:r>
-              <w:rPr>
-                <w:sz w:val="20"/>
-              </w:rPr>
-              <w:t>b</w:t>
-            </w:r>
-          </w:p>
-        </w:tc>
-        <w:tc>
-          <w:tcPr>
-            <w:tcW w:type="dxa" w:w="4320"/>
-          </w:tcPr>
-          <w:p>
-            <w:pPr>
-              <w:keepNext/>
-            </w:pPr>
-            <w:r>
-              <w:rPr>
-                <w:sz w:val="20"/>
-              </w:rPr>
-              <w:t>In goAndBack, replace navigate().to(...) with driver.get(...). Did going back still work? What does that tell you?</w:t>
-            </w:r>
-          </w:p>
-        </w:tc>
-        <w:tc>
-          <w:tcPr>
-            <w:tcW w:type="dxa" w:w="4824"/>
-          </w:tcPr>
-          <w:p>
-            <w:pPr>
-              <w:keepNext/>
-            </w:pPr>
-            <w:r>
-              <w:rPr>
-                <w:sz w:val="20"/>
-              </w:rPr>
-            </w:r>
-          </w:p>
-          <w:p>
-            <w:pPr>
-              <w:keepNext/>
-            </w:pPr>
-            <w:r>
-              <w:rPr>
-                <w:sz w:val="20"/>
-              </w:rPr>
-            </w:r>
-          </w:p>
-          <w:p>
-            <w:pPr>
-              <w:keepNext/>
-            </w:pPr>
-            <w:r>
-              <w:rPr>
-                <w:sz w:val="20"/>
-              </w:rPr>
-            </w:r>
-          </w:p>
-          <w:p>
-            <w:pPr>
-              <w:keepNext/>
-            </w:pPr>
-            <w:r>
-              <w:rPr>
-                <w:sz w:val="20"/>
-              </w:rPr>
-            </w:r>
-          </w:p>
-        </w:tc>
-      </w:tr>
-      <w:tr>
-        <w:trPr>
-          <w:cantSplit/>
-        </w:trPr>
-        <w:tc>
-          <w:tcPr>
-            <w:tcW w:type="dxa" w:w="576"/>
-          </w:tcPr>
-          <w:p>
-            <w:r>
-              <w:rPr>
-                <w:sz w:val="20"/>
-              </w:rPr>
-              <w:t>c</w:t>
-            </w:r>
-          </w:p>
-        </w:tc>
-        <w:tc>
-          <w:tcPr>
-            <w:tcW w:type="dxa" w:w="4320"/>
-          </w:tcPr>
-          <w:p>
-            <w:r>
-              <w:rPr>
-                <w:sz w:val="20"/>
-              </w:rPr>
-              <w:t>Delete the tearDown method. What do you see when the run finishes?</w:t>
-            </w:r>
-          </w:p>
-        </w:tc>
-        <w:tc>
-          <w:tcPr>
-            <w:tcW w:type="dxa" w:w="4824"/>
-          </w:tcPr>
-          <w:p>
-            <w:r>
-              <w:rPr>
-                <w:sz w:val="20"/>
-              </w:rPr>
-            </w:r>
-          </w:p>
-          <w:p>
-            <w:r>
-              <w:rPr>
-                <w:sz w:val="20"/>
-              </w:rPr>
-            </w:r>
-          </w:p>
-          <w:p>
-            <w:r>
-              <w:rPr>
-                <w:sz w:val="20"/>
-              </w:rPr>
-            </w:r>
-          </w:p>
-        </w:tc>
-      </w:tr>
-    </w:tbl>
-    <w:p>
-      <w:pPr>
-        <w:keepNext/>
-      </w:pPr>
-      <w:r>
-        <w:rPr>
-          <w:b/>
-          <w:i w:val="0"/>
-          <w:sz w:val="26"/>
-        </w:rPr>
-        <w:t>Part C: Find it and check it</w:t>
-      </w:r>
-    </w:p>
-    <w:p>
-      <w:pPr>
-        <w:keepNext/>
-      </w:pPr>
-      <w:r>
-        <w:rPr>
-          <w:b/>
-          <w:i w:val="0"/>
-          <w:sz w:val="20"/>
-        </w:rPr>
-        <w:t>Do this part after section 5. Hand it in before section 6.</w:t>
-      </w:r>
-    </w:p>
-    <w:p>
-      <w:pPr>
-        <w:pStyle w:val="Heading2"/>
-        <w:keepNext/>
-      </w:pPr>
-      <w:r>
-        <w:rPr>
-          <w:b/>
-        </w:rPr>
-        <w:t>Exercise 8: Write the locators</w:t>
-      </w:r>
-    </w:p>
-    <w:p>
-      <w:pPr>
-        <w:keepNext/>
-      </w:pPr>
-      <w:r>
-        <w:rPr>
-          <w:b w:val="0"/>
-          <w:i/>
-          <w:sz w:val="18"/>
-        </w:rPr>
-        <w:t>Sections 4 and 5 · slides 5 to 13</w:t>
+        <w:t>Section 4 · slides 5 to 13</w:t>
       </w:r>
     </w:p>
     <w:p>
@@ -4226,7 +3523,7 @@
         <w:rPr>
           <w:b/>
         </w:rPr>
-        <w:t>Exercise 9: Automate your own defects</w:t>
+        <w:t>Exercise 7: Automate an order</w:t>
       </w:r>
     </w:p>
     <w:p>
@@ -4239,7 +3536,7 @@
           <w:i/>
           <w:sz w:val="18"/>
         </w:rPr>
-        <w:t>Section 5 · slides 14 to 21</w:t>
+        <w:t>Section 4 · slides 5 to 15</w:t>
       </w:r>
     </w:p>
     <w:p>
@@ -4252,7 +3549,465 @@
           <w:i w:val="0"/>
           <w:sz w:val="20"/>
         </w:rPr>
-        <w:t>In the same project, write a class called ShopCheck:</w:t>
+        <w:t>In the same project, write a class called ShopOrder that places an order on saucedemo from start to end, the same steps you did by hand in Part A.</w:t>
+      </w:r>
+    </w:p>
+    <w:tbl>
+      <w:tblPr>
+        <w:tblW w:type="auto" w:w="0"/>
+        <w:jc w:val="center"/>
+        <w:tblLayout w:type="fixed"/>
+        <w:tblLook w:firstColumn="1" w:firstRow="1" w:lastColumn="0" w:lastRow="0" w:noHBand="0" w:noVBand="1" w:val="04A0"/>
+        <w:tblBorders>
+          <w:top w:val="single" w:sz="4" w:space="0" w:color="BFC7CC"/>
+          <w:left w:val="single" w:sz="4" w:space="0" w:color="BFC7CC"/>
+          <w:bottom w:val="single" w:sz="4" w:space="0" w:color="BFC7CC"/>
+          <w:right w:val="single" w:sz="4" w:space="0" w:color="BFC7CC"/>
+          <w:insideH w:val="single" w:sz="4" w:space="0" w:color="BFC7CC"/>
+          <w:insideV w:val="single" w:sz="4" w:space="0" w:color="BFC7CC"/>
+        </w:tblBorders>
+      </w:tblPr>
+      <w:tblGrid>
+        <w:gridCol w:w="3250"/>
+        <w:gridCol w:w="3250"/>
+        <w:gridCol w:w="3250"/>
+      </w:tblGrid>
+      <w:tr>
+        <w:trPr>
+          <w:cantSplit/>
+        </w:trPr>
+        <w:tc>
+          <w:tcPr>
+            <w:tcW w:type="dxa" w:w="1584"/>
+            <w:shd w:val="clear" w:color="auto" w:fill="2A3A42"/>
+          </w:tcPr>
+          <w:p>
+            <w:pPr>
+              <w:keepNext/>
+            </w:pPr>
+            <w:r>
+              <w:rPr>
+                <w:b/>
+                <w:color w:val="FFFFFF"/>
+                <w:sz w:val="20"/>
+              </w:rPr>
+              <w:t>Method</w:t>
+            </w:r>
+          </w:p>
+        </w:tc>
+        <w:tc>
+          <w:tcPr>
+            <w:tcW w:type="dxa" w:w="2376"/>
+            <w:shd w:val="clear" w:color="auto" w:fill="2A3A42"/>
+          </w:tcPr>
+          <w:p>
+            <w:pPr>
+              <w:keepNext/>
+            </w:pPr>
+            <w:r>
+              <w:rPr>
+                <w:b/>
+                <w:color w:val="FFFFFF"/>
+                <w:sz w:val="20"/>
+              </w:rPr>
+              <w:t>Annotation</w:t>
+            </w:r>
+          </w:p>
+        </w:tc>
+        <w:tc>
+          <w:tcPr>
+            <w:tcW w:type="dxa" w:w="5760"/>
+            <w:shd w:val="clear" w:color="auto" w:fill="2A3A42"/>
+          </w:tcPr>
+          <w:p>
+            <w:pPr>
+              <w:keepNext/>
+            </w:pPr>
+            <w:r>
+              <w:rPr>
+                <w:b/>
+                <w:color w:val="FFFFFF"/>
+                <w:sz w:val="20"/>
+              </w:rPr>
+              <w:t>What it does</w:t>
+            </w:r>
+          </w:p>
+        </w:tc>
+      </w:tr>
+      <w:tr>
+        <w:trPr>
+          <w:cantSplit/>
+        </w:trPr>
+        <w:tc>
+          <w:tcPr>
+            <w:tcW w:type="dxa" w:w="1584"/>
+          </w:tcPr>
+          <w:p>
+            <w:pPr>
+              <w:keepNext/>
+            </w:pPr>
+            <w:r>
+              <w:rPr>
+                <w:sz w:val="20"/>
+              </w:rPr>
+              <w:t>prepare</w:t>
+            </w:r>
+          </w:p>
+        </w:tc>
+        <w:tc>
+          <w:tcPr>
+            <w:tcW w:type="dxa" w:w="2376"/>
+          </w:tcPr>
+          <w:p>
+            <w:pPr>
+              <w:keepNext/>
+            </w:pPr>
+            <w:r>
+              <w:rPr>
+                <w:sz w:val="20"/>
+              </w:rPr>
+              <w:t>@BeforeTest</w:t>
+            </w:r>
+          </w:p>
+        </w:tc>
+        <w:tc>
+          <w:tcPr>
+            <w:tcW w:type="dxa" w:w="5760"/>
+          </w:tcPr>
+          <w:p>
+            <w:pPr>
+              <w:keepNext/>
+            </w:pPr>
+            <w:r>
+              <w:rPr>
+                <w:sz w:val="20"/>
+              </w:rPr>
+              <w:t>Opens Chrome: driver = Setup.chrome();</w:t>
+            </w:r>
+          </w:p>
+        </w:tc>
+      </w:tr>
+      <w:tr>
+        <w:trPr>
+          <w:cantSplit/>
+        </w:trPr>
+        <w:tc>
+          <w:tcPr>
+            <w:tcW w:type="dxa" w:w="1584"/>
+          </w:tcPr>
+          <w:p>
+            <w:pPr>
+              <w:keepNext/>
+            </w:pPr>
+            <w:r>
+              <w:rPr>
+                <w:sz w:val="20"/>
+              </w:rPr>
+              <w:t>login</w:t>
+            </w:r>
+          </w:p>
+        </w:tc>
+        <w:tc>
+          <w:tcPr>
+            <w:tcW w:type="dxa" w:w="2376"/>
+          </w:tcPr>
+          <w:p>
+            <w:pPr>
+              <w:keepNext/>
+            </w:pPr>
+            <w:r>
+              <w:rPr>
+                <w:sz w:val="20"/>
+              </w:rPr>
+              <w:t>@Test(priority = 1)</w:t>
+            </w:r>
+          </w:p>
+        </w:tc>
+        <w:tc>
+          <w:tcPr>
+            <w:tcW w:type="dxa" w:w="5760"/>
+          </w:tcPr>
+          <w:p>
+            <w:pPr>
+              <w:keepNext/>
+            </w:pPr>
+            <w:r>
+              <w:rPr>
+                <w:sz w:val="20"/>
+              </w:rPr>
+              <w:t>Opens https://www.saucedemo.com/ and logs in as standard_user with the password secret_sauce.</w:t>
+            </w:r>
+          </w:p>
+        </w:tc>
+      </w:tr>
+      <w:tr>
+        <w:trPr>
+          <w:cantSplit/>
+        </w:trPr>
+        <w:tc>
+          <w:tcPr>
+            <w:tcW w:type="dxa" w:w="1584"/>
+          </w:tcPr>
+          <w:p>
+            <w:pPr>
+              <w:keepNext/>
+            </w:pPr>
+            <w:r>
+              <w:rPr>
+                <w:sz w:val="20"/>
+              </w:rPr>
+              <w:t>addToCart</w:t>
+            </w:r>
+          </w:p>
+        </w:tc>
+        <w:tc>
+          <w:tcPr>
+            <w:tcW w:type="dxa" w:w="2376"/>
+          </w:tcPr>
+          <w:p>
+            <w:pPr>
+              <w:keepNext/>
+            </w:pPr>
+            <w:r>
+              <w:rPr>
+                <w:sz w:val="20"/>
+              </w:rPr>
+              <w:t>@Test(priority = 2)</w:t>
+            </w:r>
+          </w:p>
+        </w:tc>
+        <w:tc>
+          <w:tcPr>
+            <w:tcW w:type="dxa" w:w="5760"/>
+          </w:tcPr>
+          <w:p>
+            <w:pPr>
+              <w:keepNext/>
+            </w:pPr>
+            <w:r>
+              <w:rPr>
+                <w:sz w:val="20"/>
+              </w:rPr>
+              <w:t>Clicks Add to cart on Sauce Labs Backpack, then opens the cart.</w:t>
+            </w:r>
+          </w:p>
+        </w:tc>
+      </w:tr>
+      <w:tr>
+        <w:trPr>
+          <w:cantSplit/>
+        </w:trPr>
+        <w:tc>
+          <w:tcPr>
+            <w:tcW w:type="dxa" w:w="1584"/>
+          </w:tcPr>
+          <w:p>
+            <w:pPr>
+              <w:keepNext/>
+            </w:pPr>
+            <w:r>
+              <w:rPr>
+                <w:sz w:val="20"/>
+              </w:rPr>
+              <w:t>checkout</w:t>
+            </w:r>
+          </w:p>
+        </w:tc>
+        <w:tc>
+          <w:tcPr>
+            <w:tcW w:type="dxa" w:w="2376"/>
+          </w:tcPr>
+          <w:p>
+            <w:pPr>
+              <w:keepNext/>
+            </w:pPr>
+            <w:r>
+              <w:rPr>
+                <w:sz w:val="20"/>
+              </w:rPr>
+              <w:t>@Test(priority = 3)</w:t>
+            </w:r>
+          </w:p>
+        </w:tc>
+        <w:tc>
+          <w:tcPr>
+            <w:tcW w:type="dxa" w:w="5760"/>
+          </w:tcPr>
+          <w:p>
+            <w:pPr>
+              <w:keepNext/>
+            </w:pPr>
+            <w:r>
+              <w:rPr>
+                <w:sz w:val="20"/>
+              </w:rPr>
+              <w:t>Clicks Checkout, types a first name, a last name and a postal code, then clicks Continue.</w:t>
+            </w:r>
+          </w:p>
+        </w:tc>
+      </w:tr>
+      <w:tr>
+        <w:trPr>
+          <w:cantSplit/>
+        </w:trPr>
+        <w:tc>
+          <w:tcPr>
+            <w:tcW w:type="dxa" w:w="1584"/>
+          </w:tcPr>
+          <w:p>
+            <w:pPr>
+              <w:keepNext/>
+            </w:pPr>
+            <w:r>
+              <w:rPr>
+                <w:sz w:val="20"/>
+              </w:rPr>
+              <w:t>finish</w:t>
+            </w:r>
+          </w:p>
+        </w:tc>
+        <w:tc>
+          <w:tcPr>
+            <w:tcW w:type="dxa" w:w="2376"/>
+          </w:tcPr>
+          <w:p>
+            <w:pPr>
+              <w:keepNext/>
+            </w:pPr>
+            <w:r>
+              <w:rPr>
+                <w:sz w:val="20"/>
+              </w:rPr>
+              <w:t>@Test(priority = 4)</w:t>
+            </w:r>
+          </w:p>
+        </w:tc>
+        <w:tc>
+          <w:tcPr>
+            <w:tcW w:type="dxa" w:w="5760"/>
+          </w:tcPr>
+          <w:p>
+            <w:pPr>
+              <w:keepNext/>
+            </w:pPr>
+            <w:r>
+              <w:rPr>
+                <w:sz w:val="20"/>
+              </w:rPr>
+              <w:t>Clicks Finish.</w:t>
+            </w:r>
+          </w:p>
+        </w:tc>
+      </w:tr>
+      <w:tr>
+        <w:trPr>
+          <w:cantSplit/>
+        </w:trPr>
+        <w:tc>
+          <w:tcPr>
+            <w:tcW w:type="dxa" w:w="1584"/>
+          </w:tcPr>
+          <w:p>
+            <w:pPr>
+              <w:keepNext/>
+            </w:pPr>
+            <w:r>
+              <w:rPr>
+                <w:sz w:val="20"/>
+              </w:rPr>
+              <w:t>downloadPdf</w:t>
+            </w:r>
+          </w:p>
+        </w:tc>
+        <w:tc>
+          <w:tcPr>
+            <w:tcW w:type="dxa" w:w="2376"/>
+          </w:tcPr>
+          <w:p>
+            <w:pPr>
+              <w:keepNext/>
+            </w:pPr>
+            <w:r>
+              <w:rPr>
+                <w:sz w:val="20"/>
+              </w:rPr>
+              <w:t>@Test(priority = 5)</w:t>
+            </w:r>
+          </w:p>
+        </w:tc>
+        <w:tc>
+          <w:tcPr>
+            <w:tcW w:type="dxa" w:w="5760"/>
+          </w:tcPr>
+          <w:p>
+            <w:pPr>
+              <w:keepNext/>
+            </w:pPr>
+            <w:r>
+              <w:rPr>
+                <w:sz w:val="20"/>
+              </w:rPr>
+              <w:t>Clicks Generate PDF order. The order downloads as a PDF.</w:t>
+            </w:r>
+          </w:p>
+        </w:tc>
+      </w:tr>
+      <w:tr>
+        <w:trPr>
+          <w:cantSplit/>
+        </w:trPr>
+        <w:tc>
+          <w:tcPr>
+            <w:tcW w:type="dxa" w:w="1584"/>
+          </w:tcPr>
+          <w:p>
+            <w:r>
+              <w:rPr>
+                <w:sz w:val="20"/>
+              </w:rPr>
+              <w:t>tearDown</w:t>
+            </w:r>
+          </w:p>
+        </w:tc>
+        <w:tc>
+          <w:tcPr>
+            <w:tcW w:type="dxa" w:w="2376"/>
+          </w:tcPr>
+          <w:p>
+            <w:r>
+              <w:rPr>
+                <w:sz w:val="20"/>
+              </w:rPr>
+              <w:t>@AfterTest</w:t>
+            </w:r>
+          </w:p>
+        </w:tc>
+        <w:tc>
+          <w:tcPr>
+            <w:tcW w:type="dxa" w:w="5760"/>
+          </w:tcPr>
+          <w:p>
+            <w:r>
+              <w:rPr>
+                <w:sz w:val="20"/>
+              </w:rPr>
+              <w:t>Closes the browser.</w:t>
+            </w:r>
+          </w:p>
+        </w:tc>
+      </w:tr>
+    </w:tbl>
+    <w:p>
+      <w:pPr>
+        <w:keepNext/>
+      </w:pPr>
+      <w:r>
+        <w:rPr>
+          <w:b w:val="0"/>
+          <w:i w:val="0"/>
+          <w:sz w:val="20"/>
+        </w:rPr>
+        <w:t>Call Setup.pause() after every step so you can watch it work. Open Chrome with Setup.chrome(), not new ChromeDriver(): it turns off Chrome's password warning, which otherwise stops every click after the login.</w:t>
       </w:r>
     </w:p>
     <w:tbl>
@@ -4280,7 +4035,7 @@
         </w:trPr>
         <w:tc>
           <w:tcPr>
-            <w:tcW w:type="dxa" w:w="3312"/>
+            <w:tcW w:type="dxa" w:w="5184"/>
             <w:shd w:val="clear" w:color="auto" w:fill="2A3A42"/>
           </w:tcPr>
           <w:p>
@@ -4293,13 +4048,13 @@
                 <w:color w:val="FFFFFF"/>
                 <w:sz w:val="20"/>
               </w:rPr>
-              <w:t>Part</w:t>
+              <w:t>Name of the PDF file in your Downloads folder</w:t>
             </w:r>
           </w:p>
         </w:tc>
         <w:tc>
           <w:tcPr>
-            <w:tcW w:type="dxa" w:w="6408"/>
+            <w:tcW w:type="dxa" w:w="4536"/>
             <w:shd w:val="clear" w:color="auto" w:fill="2A3A42"/>
           </w:tcPr>
           <w:p>
@@ -4312,7 +4067,6 @@
                 <w:color w:val="FFFFFF"/>
                 <w:sz w:val="20"/>
               </w:rPr>
-              <w:t>What it does</w:t>
             </w:r>
           </w:p>
         </w:tc>
@@ -4323,479 +4077,7 @@
         </w:trPr>
         <w:tc>
           <w:tcPr>
-            <w:tcW w:type="dxa" w:w="3312"/>
-          </w:tcPr>
-          <w:p>
-            <w:pPr>
-              <w:keepNext/>
-            </w:pPr>
-            <w:r>
-              <w:rPr>
-                <w:sz w:val="20"/>
-              </w:rPr>
-              <w:t>String user = "standard_user";</w:t>
-            </w:r>
-          </w:p>
-        </w:tc>
-        <w:tc>
-          <w:tcPr>
-            <w:tcW w:type="dxa" w:w="6408"/>
-          </w:tcPr>
-          <w:p>
-            <w:pPr>
-              <w:keepNext/>
-            </w:pPr>
-            <w:r>
-              <w:rPr>
-                <w:sz w:val="20"/>
-              </w:rPr>
-              <w:t>A field at the top. You will change only this line.</w:t>
-            </w:r>
-          </w:p>
-        </w:tc>
-      </w:tr>
-      <w:tr>
-        <w:trPr>
-          <w:cantSplit/>
-        </w:trPr>
-        <w:tc>
-          <w:tcPr>
-            <w:tcW w:type="dxa" w:w="3312"/>
-          </w:tcPr>
-          <w:p>
-            <w:pPr>
-              <w:keepNext/>
-            </w:pPr>
-            <w:r>
-              <w:rPr>
-                <w:sz w:val="20"/>
-              </w:rPr>
-              <w:t>@BeforeTest</w:t>
-            </w:r>
-          </w:p>
-        </w:tc>
-        <w:tc>
-          <w:tcPr>
-            <w:tcW w:type="dxa" w:w="6408"/>
-          </w:tcPr>
-          <w:p>
-            <w:pPr>
-              <w:keepNext/>
-            </w:pPr>
-            <w:r>
-              <w:rPr>
-                <w:sz w:val="20"/>
-              </w:rPr>
-              <w:t>Opens Chrome in incognito (the three lines below) and logs in as user, using three different locator types.</w:t>
-            </w:r>
-          </w:p>
-        </w:tc>
-      </w:tr>
-      <w:tr>
-        <w:trPr>
-          <w:cantSplit/>
-        </w:trPr>
-        <w:tc>
-          <w:tcPr>
-            <w:tcW w:type="dxa" w:w="3312"/>
-          </w:tcPr>
-          <w:p>
-            <w:pPr>
-              <w:keepNext/>
-            </w:pPr>
-            <w:r>
-              <w:rPr>
-                <w:sz w:val="20"/>
-              </w:rPr>
-              <w:t>Three @Test methods</w:t>
-            </w:r>
-          </w:p>
-        </w:tc>
-        <w:tc>
-          <w:tcPr>
-            <w:tcW w:type="dxa" w:w="6408"/>
-          </w:tcPr>
-          <w:p>
-            <w:pPr>
-              <w:keepNext/>
-            </w:pPr>
-            <w:r>
-              <w:rPr>
-                <w:sz w:val="20"/>
-              </w:rPr>
-              <w:t>Each one checks one defect you found in Exercise 1 with Assert.assertEquals(actual, expected). Use getText() or getAttribute("value") to read the actual result.</w:t>
-            </w:r>
-          </w:p>
-        </w:tc>
-      </w:tr>
-      <w:tr>
-        <w:trPr>
-          <w:cantSplit/>
-        </w:trPr>
-        <w:tc>
-          <w:tcPr>
-            <w:tcW w:type="dxa" w:w="3312"/>
-          </w:tcPr>
-          <w:p>
-            <w:r>
-              <w:rPr>
-                <w:sz w:val="20"/>
-              </w:rPr>
-              <w:t>@AfterTest</w:t>
-            </w:r>
-          </w:p>
-        </w:tc>
-        <w:tc>
-          <w:tcPr>
-            <w:tcW w:type="dxa" w:w="6408"/>
-          </w:tcPr>
-          <w:p>
-            <w:r>
-              <w:rPr>
-                <w:sz w:val="20"/>
-              </w:rPr>
-              <w:t>Closes the browser.</w:t>
-            </w:r>
-          </w:p>
-        </w:tc>
-      </w:tr>
-    </w:tbl>
-    <w:p>
-      <w:pPr>
-        <w:keepNext/>
-      </w:pPr>
-      <w:r>
-        <w:rPr>
-          <w:b w:val="0"/>
-          <w:i w:val="0"/>
-          <w:sz w:val="20"/>
-        </w:rPr>
-        <w:t>Open Chrome like this. Without it, Chrome shows a "password found in a data breach" box after the login, and every click after that does nothing:</w:t>
-      </w:r>
-    </w:p>
-    <w:p>
-      <w:pPr>
-        <w:keepNext/>
-        <w:spacing w:after="0" w:line="240" w:lineRule="auto"/>
-      </w:pPr>
-      <w:r>
-        <w:rPr>
-          <w:rFonts w:ascii="Consolas" w:hAnsi="Consolas"/>
-          <w:sz w:val="18"/>
-        </w:rPr>
-        <w:t>ChromeOptions options = new ChromeOptions();</w:t>
-      </w:r>
-    </w:p>
-    <w:p>
-      <w:pPr>
-        <w:keepNext/>
-        <w:spacing w:after="0" w:line="240" w:lineRule="auto"/>
-      </w:pPr>
-      <w:r>
-        <w:rPr>
-          <w:rFonts w:ascii="Consolas" w:hAnsi="Consolas"/>
-          <w:sz w:val="18"/>
-        </w:rPr>
-        <w:t>options.addArguments("--incognito");</w:t>
-      </w:r>
-    </w:p>
-    <w:p>
-      <w:pPr>
-        <w:keepNext/>
-        <w:spacing w:after="0" w:line="240" w:lineRule="auto"/>
-      </w:pPr>
-      <w:r>
-        <w:rPr>
-          <w:rFonts w:ascii="Consolas" w:hAnsi="Consolas"/>
-          <w:sz w:val="18"/>
-        </w:rPr>
-        <w:t>driver = new ChromeDriver(options);</w:t>
-      </w:r>
-    </w:p>
-    <w:p>
-      <w:pPr>
-        <w:keepNext/>
-      </w:pPr>
-      <w:r>
-        <w:rPr>
-          <w:b w:val="0"/>
-          <w:i w:val="0"/>
-          <w:sz w:val="20"/>
-        </w:rPr>
-      </w:r>
-    </w:p>
-    <w:p>
-      <w:pPr>
-        <w:keepNext/>
-      </w:pPr>
-      <w:r>
-        <w:rPr>
-          <w:b w:val="0"/>
-          <w:i w:val="0"/>
-          <w:sz w:val="20"/>
-        </w:rPr>
-        <w:t>Run it as standard_user: all three must pass. Then change the field to problem_user and run it again.</w:t>
-      </w:r>
-    </w:p>
-    <w:tbl>
-      <w:tblPr>
-        <w:tblW w:type="auto" w:w="0"/>
-        <w:jc w:val="center"/>
-        <w:tblLayout w:type="fixed"/>
-        <w:tblLook w:firstColumn="1" w:firstRow="1" w:lastColumn="0" w:lastRow="0" w:noHBand="0" w:noVBand="1" w:val="04A0"/>
-        <w:tblBorders>
-          <w:top w:val="single" w:sz="4" w:space="0" w:color="BFC7CC"/>
-          <w:left w:val="single" w:sz="4" w:space="0" w:color="BFC7CC"/>
-          <w:bottom w:val="single" w:sz="4" w:space="0" w:color="BFC7CC"/>
-          <w:right w:val="single" w:sz="4" w:space="0" w:color="BFC7CC"/>
-          <w:insideH w:val="single" w:sz="4" w:space="0" w:color="BFC7CC"/>
-          <w:insideV w:val="single" w:sz="4" w:space="0" w:color="BFC7CC"/>
-        </w:tblBorders>
-      </w:tblPr>
-      <w:tblGrid>
-        <w:gridCol w:w="2437"/>
-        <w:gridCol w:w="2437"/>
-        <w:gridCol w:w="2437"/>
-        <w:gridCol w:w="2437"/>
-      </w:tblGrid>
-      <w:tr>
-        <w:trPr>
-          <w:cantSplit/>
-        </w:trPr>
-        <w:tc>
-          <w:tcPr>
-            <w:tcW w:type="dxa" w:w="2304"/>
-            <w:shd w:val="clear" w:color="auto" w:fill="2A3A42"/>
-          </w:tcPr>
-          <w:p>
-            <w:pPr>
-              <w:keepNext/>
-            </w:pPr>
-            <w:r>
-              <w:rPr>
-                <w:b/>
-                <w:color w:val="FFFFFF"/>
-                <w:sz w:val="20"/>
-              </w:rPr>
-              <w:t>Test method</w:t>
-            </w:r>
-          </w:p>
-        </w:tc>
-        <w:tc>
-          <w:tcPr>
-            <w:tcW w:type="dxa" w:w="1656"/>
-            <w:shd w:val="clear" w:color="auto" w:fill="2A3A42"/>
-          </w:tcPr>
-          <w:p>
-            <w:pPr>
-              <w:keepNext/>
-            </w:pPr>
-            <w:r>
-              <w:rPr>
-                <w:b/>
-                <w:color w:val="FFFFFF"/>
-                <w:sz w:val="20"/>
-              </w:rPr>
-              <w:t>Defect # (Exercise 1)</w:t>
-            </w:r>
-          </w:p>
-        </w:tc>
-        <w:tc>
-          <w:tcPr>
-            <w:tcW w:type="dxa" w:w="1728"/>
-            <w:shd w:val="clear" w:color="auto" w:fill="2A3A42"/>
-          </w:tcPr>
-          <w:p>
-            <w:pPr>
-              <w:keepNext/>
-            </w:pPr>
-            <w:r>
-              <w:rPr>
-                <w:b/>
-                <w:color w:val="FFFFFF"/>
-                <w:sz w:val="20"/>
-              </w:rPr>
-              <w:t>Passed as standard_user?</w:t>
-            </w:r>
-          </w:p>
-        </w:tc>
-        <w:tc>
-          <w:tcPr>
-            <w:tcW w:type="dxa" w:w="4032"/>
-            <w:shd w:val="clear" w:color="auto" w:fill="2A3A42"/>
-          </w:tcPr>
-          <w:p>
-            <w:pPr>
-              <w:keepNext/>
-            </w:pPr>
-            <w:r>
-              <w:rPr>
-                <w:b/>
-                <w:color w:val="FFFFFF"/>
-                <w:sz w:val="20"/>
-              </w:rPr>
-              <w:t>Failure message as problem_user</w:t>
-            </w:r>
-          </w:p>
-        </w:tc>
-      </w:tr>
-      <w:tr>
-        <w:trPr>
-          <w:cantSplit/>
-        </w:trPr>
-        <w:tc>
-          <w:tcPr>
-            <w:tcW w:type="dxa" w:w="2304"/>
-          </w:tcPr>
-          <w:p>
-            <w:pPr>
-              <w:keepNext/>
-            </w:pPr>
-            <w:r>
-              <w:rPr>
-                <w:sz w:val="20"/>
-              </w:rPr>
-            </w:r>
-          </w:p>
-          <w:p>
-            <w:pPr>
-              <w:keepNext/>
-            </w:pPr>
-            <w:r>
-              <w:rPr>
-                <w:sz w:val="20"/>
-              </w:rPr>
-            </w:r>
-          </w:p>
-        </w:tc>
-        <w:tc>
-          <w:tcPr>
-            <w:tcW w:type="dxa" w:w="1656"/>
-          </w:tcPr>
-          <w:p>
-            <w:pPr>
-              <w:keepNext/>
-            </w:pPr>
-            <w:r>
-              <w:rPr>
-                <w:sz w:val="20"/>
-              </w:rPr>
-            </w:r>
-          </w:p>
-        </w:tc>
-        <w:tc>
-          <w:tcPr>
-            <w:tcW w:type="dxa" w:w="1728"/>
-          </w:tcPr>
-          <w:p>
-            <w:pPr>
-              <w:keepNext/>
-            </w:pPr>
-            <w:r>
-              <w:rPr>
-                <w:sz w:val="20"/>
-              </w:rPr>
-            </w:r>
-          </w:p>
-        </w:tc>
-        <w:tc>
-          <w:tcPr>
-            <w:tcW w:type="dxa" w:w="4032"/>
-          </w:tcPr>
-          <w:p>
-            <w:pPr>
-              <w:keepNext/>
-            </w:pPr>
-            <w:r>
-              <w:rPr>
-                <w:sz w:val="20"/>
-              </w:rPr>
-            </w:r>
-          </w:p>
-        </w:tc>
-      </w:tr>
-      <w:tr>
-        <w:trPr>
-          <w:cantSplit/>
-        </w:trPr>
-        <w:tc>
-          <w:tcPr>
-            <w:tcW w:type="dxa" w:w="2304"/>
-          </w:tcPr>
-          <w:p>
-            <w:pPr>
-              <w:keepNext/>
-            </w:pPr>
-            <w:r>
-              <w:rPr>
-                <w:sz w:val="20"/>
-              </w:rPr>
-            </w:r>
-          </w:p>
-          <w:p>
-            <w:pPr>
-              <w:keepNext/>
-            </w:pPr>
-            <w:r>
-              <w:rPr>
-                <w:sz w:val="20"/>
-              </w:rPr>
-            </w:r>
-          </w:p>
-        </w:tc>
-        <w:tc>
-          <w:tcPr>
-            <w:tcW w:type="dxa" w:w="1656"/>
-          </w:tcPr>
-          <w:p>
-            <w:pPr>
-              <w:keepNext/>
-            </w:pPr>
-            <w:r>
-              <w:rPr>
-                <w:sz w:val="20"/>
-              </w:rPr>
-            </w:r>
-          </w:p>
-        </w:tc>
-        <w:tc>
-          <w:tcPr>
-            <w:tcW w:type="dxa" w:w="1728"/>
-          </w:tcPr>
-          <w:p>
-            <w:pPr>
-              <w:keepNext/>
-            </w:pPr>
-            <w:r>
-              <w:rPr>
-                <w:sz w:val="20"/>
-              </w:rPr>
-            </w:r>
-          </w:p>
-        </w:tc>
-        <w:tc>
-          <w:tcPr>
-            <w:tcW w:type="dxa" w:w="4032"/>
-          </w:tcPr>
-          <w:p>
-            <w:pPr>
-              <w:keepNext/>
-            </w:pPr>
-            <w:r>
-              <w:rPr>
-                <w:sz w:val="20"/>
-              </w:rPr>
-            </w:r>
-          </w:p>
-        </w:tc>
-      </w:tr>
-      <w:tr>
-        <w:trPr>
-          <w:cantSplit/>
-        </w:trPr>
-        <w:tc>
-          <w:tcPr>
-            <w:tcW w:type="dxa" w:w="2304"/>
+            <w:tcW w:type="dxa" w:w="5184"/>
           </w:tcPr>
           <w:p>
             <w:r>
@@ -4814,31 +4096,7 @@
         </w:tc>
         <w:tc>
           <w:tcPr>
-            <w:tcW w:type="dxa" w:w="1656"/>
-          </w:tcPr>
-          <w:p>
-            <w:r>
-              <w:rPr>
-                <w:sz w:val="20"/>
-              </w:rPr>
-            </w:r>
-          </w:p>
-        </w:tc>
-        <w:tc>
-          <w:tcPr>
-            <w:tcW w:type="dxa" w:w="1728"/>
-          </w:tcPr>
-          <w:p>
-            <w:r>
-              <w:rPr>
-                <w:sz w:val="20"/>
-              </w:rPr>
-            </w:r>
-          </w:p>
-        </w:tc>
-        <w:tc>
-          <w:tcPr>
-            <w:tcW w:type="dxa" w:w="4032"/>
+            <w:tcW w:type="dxa" w:w="4536"/>
           </w:tcPr>
           <w:p>
             <w:r>

</xml_diff>

<commit_message>
Weeks 3-4 sheet: drop the locators exercise and the printed-output table
</commit_message>
<xml_diff>
--- a/week-04/Weeks 3-4 - Lab Sheet.docx
+++ b/week-04/Weeks 3-4 - Lab Sheet.docx
@@ -2619,261 +2619,11 @@
       </w:pPr>
       <w:r>
         <w:rPr>
-          <w:b w:val="0"/>
-          <w:i w:val="0"/>
-          <w:sz w:val="20"/>
-        </w:rPr>
-        <w:t>Run it, then copy what it printed.</w:t>
-      </w:r>
-    </w:p>
-    <w:tbl>
-      <w:tblPr>
-        <w:tblW w:type="auto" w:w="0"/>
-        <w:jc w:val="center"/>
-        <w:tblLayout w:type="fixed"/>
-        <w:tblLook w:firstColumn="1" w:firstRow="1" w:lastColumn="0" w:lastRow="0" w:noHBand="0" w:noVBand="1" w:val="04A0"/>
-        <w:tblBorders>
-          <w:top w:val="single" w:sz="4" w:space="0" w:color="BFC7CC"/>
-          <w:left w:val="single" w:sz="4" w:space="0" w:color="BFC7CC"/>
-          <w:bottom w:val="single" w:sz="4" w:space="0" w:color="BFC7CC"/>
-          <w:right w:val="single" w:sz="4" w:space="0" w:color="BFC7CC"/>
-          <w:insideH w:val="single" w:sz="4" w:space="0" w:color="BFC7CC"/>
-          <w:insideV w:val="single" w:sz="4" w:space="0" w:color="BFC7CC"/>
-        </w:tblBorders>
-      </w:tblPr>
-      <w:tblGrid>
-        <w:gridCol w:w="4874"/>
-        <w:gridCol w:w="4874"/>
-      </w:tblGrid>
-      <w:tr>
-        <w:trPr>
-          <w:cantSplit/>
-        </w:trPr>
-        <w:tc>
-          <w:tcPr>
-            <w:tcW w:type="dxa" w:w="3960"/>
-            <w:shd w:val="clear" w:color="auto" w:fill="2A3A42"/>
-          </w:tcPr>
-          <w:p>
-            <w:pPr>
-              <w:keepNext/>
-            </w:pPr>
-            <w:r>
-              <w:rPr>
-                <w:b/>
-                <w:color w:val="FFFFFF"/>
-                <w:sz w:val="20"/>
-              </w:rPr>
-              <w:t>What was printed</w:t>
-            </w:r>
-          </w:p>
-        </w:tc>
-        <w:tc>
-          <w:tcPr>
-            <w:tcW w:type="dxa" w:w="5760"/>
-            <w:shd w:val="clear" w:color="auto" w:fill="2A3A42"/>
-          </w:tcPr>
-          <w:p>
-            <w:pPr>
-              <w:keepNext/>
-            </w:pPr>
-            <w:r>
-              <w:rPr>
-                <w:b/>
-                <w:color w:val="FFFFFF"/>
-                <w:sz w:val="20"/>
-              </w:rPr>
-              <w:t>Your output</w:t>
-            </w:r>
-          </w:p>
-        </w:tc>
-      </w:tr>
-      <w:tr>
-        <w:trPr>
-          <w:cantSplit/>
-        </w:trPr>
-        <w:tc>
-          <w:tcPr>
-            <w:tcW w:type="dxa" w:w="3960"/>
-          </w:tcPr>
-          <w:p>
-            <w:pPr>
-              <w:keepNext/>
-            </w:pPr>
-            <w:r>
-              <w:rPr>
-                <w:sz w:val="20"/>
-              </w:rPr>
-              <w:t>Title (openShop)</w:t>
-            </w:r>
-          </w:p>
-        </w:tc>
-        <w:tc>
-          <w:tcPr>
-            <w:tcW w:type="dxa" w:w="5760"/>
-          </w:tcPr>
-          <w:p>
-            <w:pPr>
-              <w:keepNext/>
-            </w:pPr>
-            <w:r>
-              <w:rPr>
-                <w:sz w:val="20"/>
-              </w:rPr>
-            </w:r>
-          </w:p>
-        </w:tc>
-      </w:tr>
-      <w:tr>
-        <w:trPr>
-          <w:cantSplit/>
-        </w:trPr>
-        <w:tc>
-          <w:tcPr>
-            <w:tcW w:type="dxa" w:w="3960"/>
-          </w:tcPr>
-          <w:p>
-            <w:pPr>
-              <w:keepNext/>
-            </w:pPr>
-            <w:r>
-              <w:rPr>
-                <w:sz w:val="20"/>
-              </w:rPr>
-              <w:t>URL (openShop)</w:t>
-            </w:r>
-          </w:p>
-        </w:tc>
-        <w:tc>
-          <w:tcPr>
-            <w:tcW w:type="dxa" w:w="5760"/>
-          </w:tcPr>
-          <w:p>
-            <w:pPr>
-              <w:keepNext/>
-            </w:pPr>
-            <w:r>
-              <w:rPr>
-                <w:sz w:val="20"/>
-              </w:rPr>
-            </w:r>
-          </w:p>
-        </w:tc>
-      </w:tr>
-      <w:tr>
-        <w:trPr>
-          <w:cantSplit/>
-        </w:trPr>
-        <w:tc>
-          <w:tcPr>
-            <w:tcW w:type="dxa" w:w="3960"/>
-          </w:tcPr>
-          <w:p>
-            <w:pPr>
-              <w:keepNext/>
-            </w:pPr>
-            <w:r>
-              <w:rPr>
-                <w:sz w:val="20"/>
-              </w:rPr>
-              <w:t>Title after going back</w:t>
-            </w:r>
-          </w:p>
-        </w:tc>
-        <w:tc>
-          <w:tcPr>
-            <w:tcW w:type="dxa" w:w="5760"/>
-          </w:tcPr>
-          <w:p>
-            <w:pPr>
-              <w:keepNext/>
-            </w:pPr>
-            <w:r>
-              <w:rPr>
-                <w:sz w:val="20"/>
-              </w:rPr>
-            </w:r>
-          </w:p>
-        </w:tc>
-      </w:tr>
-      <w:tr>
-        <w:trPr>
-          <w:cantSplit/>
-        </w:trPr>
-        <w:tc>
-          <w:tcPr>
-            <w:tcW w:type="dxa" w:w="3960"/>
-          </w:tcPr>
-          <w:p>
-            <w:pPr>
-              <w:keepNext/>
-            </w:pPr>
-            <w:r>
-              <w:rPr>
-                <w:sz w:val="20"/>
-              </w:rPr>
-              <w:t>First tab handle (first 6 characters)</w:t>
-            </w:r>
-          </w:p>
-        </w:tc>
-        <w:tc>
-          <w:tcPr>
-            <w:tcW w:type="dxa" w:w="5760"/>
-          </w:tcPr>
-          <w:p>
-            <w:pPr>
-              <w:keepNext/>
-            </w:pPr>
-            <w:r>
-              <w:rPr>
-                <w:sz w:val="20"/>
-              </w:rPr>
-            </w:r>
-          </w:p>
-        </w:tc>
-      </w:tr>
-      <w:tr>
-        <w:trPr>
-          <w:cantSplit/>
-        </w:trPr>
-        <w:tc>
-          <w:tcPr>
-            <w:tcW w:type="dxa" w:w="3960"/>
-          </w:tcPr>
-          <w:p>
-            <w:r>
-              <w:rPr>
-                <w:sz w:val="20"/>
-              </w:rPr>
-              <w:t>Second tab handle (first 6 characters)</w:t>
-            </w:r>
-          </w:p>
-        </w:tc>
-        <w:tc>
-          <w:tcPr>
-            <w:tcW w:type="dxa" w:w="5760"/>
-          </w:tcPr>
-          <w:p>
-            <w:r>
-              <w:rPr>
-                <w:sz w:val="20"/>
-              </w:rPr>
-            </w:r>
-          </w:p>
-        </w:tc>
-      </w:tr>
-    </w:tbl>
-    <w:p>
-      <w:pPr>
-        <w:keepNext/>
-      </w:pPr>
-      <w:r>
-        <w:rPr>
           <w:b/>
           <w:i w:val="0"/>
           <w:sz w:val="26"/>
         </w:rPr>
-        <w:t>Part C: Find it and automate it</w:t>
+        <w:t>Part C: Automate an order</w:t>
       </w:r>
     </w:p>
     <w:p>
@@ -2885,645 +2635,7 @@
         <w:rPr>
           <w:b/>
         </w:rPr>
-        <w:t>Exercise 6: Write the locators</w:t>
-      </w:r>
-    </w:p>
-    <w:p>
-      <w:pPr>
-        <w:keepNext/>
-      </w:pPr>
-      <w:r>
-        <w:rPr>
-          <w:b w:val="0"/>
-          <w:i/>
-          <w:sz w:val="18"/>
-        </w:rPr>
-        <w:t>Section 4 · slides 5 to 13</w:t>
-      </w:r>
-    </w:p>
-    <w:p>
-      <w:pPr>
-        <w:keepNext/>
-      </w:pPr>
-      <w:r>
-        <w:rPr>
-          <w:b w:val="0"/>
-          <w:i w:val="0"/>
-          <w:sz w:val="20"/>
-        </w:rPr>
-        <w:t>On saucedemo.com, open DevTools (F12) and write one locator for each element. Test it with Ctrl + F in the Elements tab and write how many matches it found.</w:t>
-      </w:r>
-    </w:p>
-    <w:tbl>
-      <w:tblPr>
-        <w:tblW w:type="auto" w:w="0"/>
-        <w:jc w:val="center"/>
-        <w:tblLayout w:type="fixed"/>
-        <w:tblLook w:firstColumn="1" w:firstRow="1" w:lastColumn="0" w:lastRow="0" w:noHBand="0" w:noVBand="1" w:val="04A0"/>
-        <w:tblBorders>
-          <w:top w:val="single" w:sz="4" w:space="0" w:color="BFC7CC"/>
-          <w:left w:val="single" w:sz="4" w:space="0" w:color="BFC7CC"/>
-          <w:bottom w:val="single" w:sz="4" w:space="0" w:color="BFC7CC"/>
-          <w:right w:val="single" w:sz="4" w:space="0" w:color="BFC7CC"/>
-          <w:insideH w:val="single" w:sz="4" w:space="0" w:color="BFC7CC"/>
-          <w:insideV w:val="single" w:sz="4" w:space="0" w:color="BFC7CC"/>
-        </w:tblBorders>
-      </w:tblPr>
-      <w:tblGrid>
-        <w:gridCol w:w="1950"/>
-        <w:gridCol w:w="1950"/>
-        <w:gridCol w:w="1950"/>
-        <w:gridCol w:w="1950"/>
-        <w:gridCol w:w="1950"/>
-      </w:tblGrid>
-      <w:tr>
-        <w:trPr>
-          <w:cantSplit/>
-        </w:trPr>
-        <w:tc>
-          <w:tcPr>
-            <w:tcW w:type="dxa" w:w="504"/>
-            <w:shd w:val="clear" w:color="auto" w:fill="2A3A42"/>
-          </w:tcPr>
-          <w:p>
-            <w:pPr>
-              <w:keepNext/>
-            </w:pPr>
-            <w:r>
-              <w:rPr>
-                <w:b/>
-                <w:color w:val="FFFFFF"/>
-                <w:sz w:val="20"/>
-              </w:rPr>
-              <w:t>#</w:t>
-            </w:r>
-          </w:p>
-        </w:tc>
-        <w:tc>
-          <w:tcPr>
-            <w:tcW w:type="dxa" w:w="3456"/>
-            <w:shd w:val="clear" w:color="auto" w:fill="2A3A42"/>
-          </w:tcPr>
-          <w:p>
-            <w:pPr>
-              <w:keepNext/>
-            </w:pPr>
-            <w:r>
-              <w:rPr>
-                <w:b/>
-                <w:color w:val="FFFFFF"/>
-                <w:sz w:val="20"/>
-              </w:rPr>
-              <w:t>Element</w:t>
-            </w:r>
-          </w:p>
-        </w:tc>
-        <w:tc>
-          <w:tcPr>
-            <w:tcW w:type="dxa" w:w="3312"/>
-            <w:shd w:val="clear" w:color="auto" w:fill="2A3A42"/>
-          </w:tcPr>
-          <w:p>
-            <w:pPr>
-              <w:keepNext/>
-            </w:pPr>
-            <w:r>
-              <w:rPr>
-                <w:b/>
-                <w:color w:val="FFFFFF"/>
-                <w:sz w:val="20"/>
-              </w:rPr>
-              <w:t>Your locator</w:t>
-            </w:r>
-          </w:p>
-        </w:tc>
-        <w:tc>
-          <w:tcPr>
-            <w:tcW w:type="dxa" w:w="1224"/>
-            <w:shd w:val="clear" w:color="auto" w:fill="2A3A42"/>
-          </w:tcPr>
-          <w:p>
-            <w:pPr>
-              <w:keepNext/>
-            </w:pPr>
-            <w:r>
-              <w:rPr>
-                <w:b/>
-                <w:color w:val="FFFFFF"/>
-                <w:sz w:val="20"/>
-              </w:rPr>
-              <w:t>Type</w:t>
-            </w:r>
-          </w:p>
-        </w:tc>
-        <w:tc>
-          <w:tcPr>
-            <w:tcW w:type="dxa" w:w="1224"/>
-            <w:shd w:val="clear" w:color="auto" w:fill="2A3A42"/>
-          </w:tcPr>
-          <w:p>
-            <w:pPr>
-              <w:keepNext/>
-            </w:pPr>
-            <w:r>
-              <w:rPr>
-                <w:b/>
-                <w:color w:val="FFFFFF"/>
-                <w:sz w:val="20"/>
-              </w:rPr>
-              <w:t>Matches</w:t>
-            </w:r>
-          </w:p>
-        </w:tc>
-      </w:tr>
-      <w:tr>
-        <w:trPr>
-          <w:cantSplit/>
-        </w:trPr>
-        <w:tc>
-          <w:tcPr>
-            <w:tcW w:type="dxa" w:w="504"/>
-          </w:tcPr>
-          <w:p>
-            <w:pPr>
-              <w:keepNext/>
-            </w:pPr>
-            <w:r>
-              <w:rPr>
-                <w:sz w:val="20"/>
-              </w:rPr>
-              <w:t>1</w:t>
-            </w:r>
-          </w:p>
-        </w:tc>
-        <w:tc>
-          <w:tcPr>
-            <w:tcW w:type="dxa" w:w="3456"/>
-          </w:tcPr>
-          <w:p>
-            <w:pPr>
-              <w:keepNext/>
-            </w:pPr>
-            <w:r>
-              <w:rPr>
-                <w:sz w:val="20"/>
-              </w:rPr>
-              <w:t>The Username field, using its name</w:t>
-            </w:r>
-          </w:p>
-        </w:tc>
-        <w:tc>
-          <w:tcPr>
-            <w:tcW w:type="dxa" w:w="3312"/>
-          </w:tcPr>
-          <w:p>
-            <w:pPr>
-              <w:keepNext/>
-            </w:pPr>
-            <w:r>
-              <w:rPr>
-                <w:sz w:val="20"/>
-              </w:rPr>
-            </w:r>
-          </w:p>
-        </w:tc>
-        <w:tc>
-          <w:tcPr>
-            <w:tcW w:type="dxa" w:w="1224"/>
-          </w:tcPr>
-          <w:p>
-            <w:pPr>
-              <w:keepNext/>
-            </w:pPr>
-            <w:r>
-              <w:rPr>
-                <w:sz w:val="20"/>
-              </w:rPr>
-            </w:r>
-          </w:p>
-        </w:tc>
-        <w:tc>
-          <w:tcPr>
-            <w:tcW w:type="dxa" w:w="1224"/>
-          </w:tcPr>
-          <w:p>
-            <w:pPr>
-              <w:keepNext/>
-            </w:pPr>
-            <w:r>
-              <w:rPr>
-                <w:sz w:val="20"/>
-              </w:rPr>
-            </w:r>
-          </w:p>
-        </w:tc>
-      </w:tr>
-      <w:tr>
-        <w:trPr>
-          <w:cantSplit/>
-        </w:trPr>
-        <w:tc>
-          <w:tcPr>
-            <w:tcW w:type="dxa" w:w="504"/>
-          </w:tcPr>
-          <w:p>
-            <w:pPr>
-              <w:keepNext/>
-            </w:pPr>
-            <w:r>
-              <w:rPr>
-                <w:sz w:val="20"/>
-              </w:rPr>
-              <w:t>2</w:t>
-            </w:r>
-          </w:p>
-        </w:tc>
-        <w:tc>
-          <w:tcPr>
-            <w:tcW w:type="dxa" w:w="3456"/>
-          </w:tcPr>
-          <w:p>
-            <w:pPr>
-              <w:keepNext/>
-            </w:pPr>
-            <w:r>
-              <w:rPr>
-                <w:sz w:val="20"/>
-              </w:rPr>
-              <w:t>The Login button, without using its id</w:t>
-            </w:r>
-          </w:p>
-        </w:tc>
-        <w:tc>
-          <w:tcPr>
-            <w:tcW w:type="dxa" w:w="3312"/>
-          </w:tcPr>
-          <w:p>
-            <w:pPr>
-              <w:keepNext/>
-            </w:pPr>
-            <w:r>
-              <w:rPr>
-                <w:sz w:val="20"/>
-              </w:rPr>
-            </w:r>
-          </w:p>
-        </w:tc>
-        <w:tc>
-          <w:tcPr>
-            <w:tcW w:type="dxa" w:w="1224"/>
-          </w:tcPr>
-          <w:p>
-            <w:pPr>
-              <w:keepNext/>
-            </w:pPr>
-            <w:r>
-              <w:rPr>
-                <w:sz w:val="20"/>
-              </w:rPr>
-            </w:r>
-          </w:p>
-        </w:tc>
-        <w:tc>
-          <w:tcPr>
-            <w:tcW w:type="dxa" w:w="1224"/>
-          </w:tcPr>
-          <w:p>
-            <w:pPr>
-              <w:keepNext/>
-            </w:pPr>
-            <w:r>
-              <w:rPr>
-                <w:sz w:val="20"/>
-              </w:rPr>
-            </w:r>
-          </w:p>
-        </w:tc>
-      </w:tr>
-      <w:tr>
-        <w:trPr>
-          <w:cantSplit/>
-        </w:trPr>
-        <w:tc>
-          <w:tcPr>
-            <w:tcW w:type="dxa" w:w="504"/>
-          </w:tcPr>
-          <w:p>
-            <w:pPr>
-              <w:keepNext/>
-            </w:pPr>
-            <w:r>
-              <w:rPr>
-                <w:sz w:val="20"/>
-              </w:rPr>
-              <w:t>3</w:t>
-            </w:r>
-          </w:p>
-        </w:tc>
-        <w:tc>
-          <w:tcPr>
-            <w:tcW w:type="dxa" w:w="3456"/>
-          </w:tcPr>
-          <w:p>
-            <w:pPr>
-              <w:keepNext/>
-            </w:pPr>
-            <w:r>
-              <w:rPr>
-                <w:sz w:val="20"/>
-              </w:rPr>
-              <w:t>The error message after clicking Login with both fields empty</w:t>
-            </w:r>
-          </w:p>
-        </w:tc>
-        <w:tc>
-          <w:tcPr>
-            <w:tcW w:type="dxa" w:w="3312"/>
-          </w:tcPr>
-          <w:p>
-            <w:pPr>
-              <w:keepNext/>
-            </w:pPr>
-            <w:r>
-              <w:rPr>
-                <w:sz w:val="20"/>
-              </w:rPr>
-            </w:r>
-          </w:p>
-        </w:tc>
-        <w:tc>
-          <w:tcPr>
-            <w:tcW w:type="dxa" w:w="1224"/>
-          </w:tcPr>
-          <w:p>
-            <w:pPr>
-              <w:keepNext/>
-            </w:pPr>
-            <w:r>
-              <w:rPr>
-                <w:sz w:val="20"/>
-              </w:rPr>
-            </w:r>
-          </w:p>
-        </w:tc>
-        <w:tc>
-          <w:tcPr>
-            <w:tcW w:type="dxa" w:w="1224"/>
-          </w:tcPr>
-          <w:p>
-            <w:pPr>
-              <w:keepNext/>
-            </w:pPr>
-            <w:r>
-              <w:rPr>
-                <w:sz w:val="20"/>
-              </w:rPr>
-            </w:r>
-          </w:p>
-        </w:tc>
-      </w:tr>
-      <w:tr>
-        <w:trPr>
-          <w:cantSplit/>
-        </w:trPr>
-        <w:tc>
-          <w:tcPr>
-            <w:tcW w:type="dxa" w:w="504"/>
-          </w:tcPr>
-          <w:p>
-            <w:pPr>
-              <w:keepNext/>
-            </w:pPr>
-            <w:r>
-              <w:rPr>
-                <w:sz w:val="20"/>
-              </w:rPr>
-              <w:t>4</w:t>
-            </w:r>
-          </w:p>
-        </w:tc>
-        <w:tc>
-          <w:tcPr>
-            <w:tcW w:type="dxa" w:w="3456"/>
-          </w:tcPr>
-          <w:p>
-            <w:pPr>
-              <w:keepNext/>
-            </w:pPr>
-            <w:r>
-              <w:rPr>
-                <w:sz w:val="20"/>
-              </w:rPr>
-              <w:t>The word Products after you log in</w:t>
-            </w:r>
-          </w:p>
-        </w:tc>
-        <w:tc>
-          <w:tcPr>
-            <w:tcW w:type="dxa" w:w="3312"/>
-          </w:tcPr>
-          <w:p>
-            <w:pPr>
-              <w:keepNext/>
-            </w:pPr>
-            <w:r>
-              <w:rPr>
-                <w:sz w:val="20"/>
-              </w:rPr>
-            </w:r>
-          </w:p>
-        </w:tc>
-        <w:tc>
-          <w:tcPr>
-            <w:tcW w:type="dxa" w:w="1224"/>
-          </w:tcPr>
-          <w:p>
-            <w:pPr>
-              <w:keepNext/>
-            </w:pPr>
-            <w:r>
-              <w:rPr>
-                <w:sz w:val="20"/>
-              </w:rPr>
-            </w:r>
-          </w:p>
-        </w:tc>
-        <w:tc>
-          <w:tcPr>
-            <w:tcW w:type="dxa" w:w="1224"/>
-          </w:tcPr>
-          <w:p>
-            <w:pPr>
-              <w:keepNext/>
-            </w:pPr>
-            <w:r>
-              <w:rPr>
-                <w:sz w:val="20"/>
-              </w:rPr>
-            </w:r>
-          </w:p>
-        </w:tc>
-      </w:tr>
-      <w:tr>
-        <w:trPr>
-          <w:cantSplit/>
-        </w:trPr>
-        <w:tc>
-          <w:tcPr>
-            <w:tcW w:type="dxa" w:w="504"/>
-          </w:tcPr>
-          <w:p>
-            <w:pPr>
-              <w:keepNext/>
-            </w:pPr>
-            <w:r>
-              <w:rPr>
-                <w:sz w:val="20"/>
-              </w:rPr>
-              <w:t>5</w:t>
-            </w:r>
-          </w:p>
-        </w:tc>
-        <w:tc>
-          <w:tcPr>
-            <w:tcW w:type="dxa" w:w="3456"/>
-          </w:tcPr>
-          <w:p>
-            <w:pPr>
-              <w:keepNext/>
-            </w:pPr>
-            <w:r>
-              <w:rPr>
-                <w:sz w:val="20"/>
-              </w:rPr>
-              <w:t>The Add to cart button of Sauce Labs Onesie</w:t>
-            </w:r>
-          </w:p>
-        </w:tc>
-        <w:tc>
-          <w:tcPr>
-            <w:tcW w:type="dxa" w:w="3312"/>
-          </w:tcPr>
-          <w:p>
-            <w:pPr>
-              <w:keepNext/>
-            </w:pPr>
-            <w:r>
-              <w:rPr>
-                <w:sz w:val="20"/>
-              </w:rPr>
-            </w:r>
-          </w:p>
-        </w:tc>
-        <w:tc>
-          <w:tcPr>
-            <w:tcW w:type="dxa" w:w="1224"/>
-          </w:tcPr>
-          <w:p>
-            <w:pPr>
-              <w:keepNext/>
-            </w:pPr>
-            <w:r>
-              <w:rPr>
-                <w:sz w:val="20"/>
-              </w:rPr>
-            </w:r>
-          </w:p>
-        </w:tc>
-        <w:tc>
-          <w:tcPr>
-            <w:tcW w:type="dxa" w:w="1224"/>
-          </w:tcPr>
-          <w:p>
-            <w:pPr>
-              <w:keepNext/>
-            </w:pPr>
-            <w:r>
-              <w:rPr>
-                <w:sz w:val="20"/>
-              </w:rPr>
-            </w:r>
-          </w:p>
-        </w:tc>
-      </w:tr>
-      <w:tr>
-        <w:trPr>
-          <w:cantSplit/>
-        </w:trPr>
-        <w:tc>
-          <w:tcPr>
-            <w:tcW w:type="dxa" w:w="504"/>
-          </w:tcPr>
-          <w:p>
-            <w:r>
-              <w:rPr>
-                <w:sz w:val="20"/>
-              </w:rPr>
-              <w:t>6</w:t>
-            </w:r>
-          </w:p>
-        </w:tc>
-        <w:tc>
-          <w:tcPr>
-            <w:tcW w:type="dxa" w:w="3456"/>
-          </w:tcPr>
-          <w:p>
-            <w:r>
-              <w:rPr>
-                <w:sz w:val="20"/>
-              </w:rPr>
-              <w:t>The number on the cart after you add one item</w:t>
-            </w:r>
-          </w:p>
-        </w:tc>
-        <w:tc>
-          <w:tcPr>
-            <w:tcW w:type="dxa" w:w="3312"/>
-          </w:tcPr>
-          <w:p>
-            <w:r>
-              <w:rPr>
-                <w:sz w:val="20"/>
-              </w:rPr>
-            </w:r>
-          </w:p>
-        </w:tc>
-        <w:tc>
-          <w:tcPr>
-            <w:tcW w:type="dxa" w:w="1224"/>
-          </w:tcPr>
-          <w:p>
-            <w:r>
-              <w:rPr>
-                <w:sz w:val="20"/>
-              </w:rPr>
-            </w:r>
-          </w:p>
-        </w:tc>
-        <w:tc>
-          <w:tcPr>
-            <w:tcW w:type="dxa" w:w="1224"/>
-          </w:tcPr>
-          <w:p>
-            <w:r>
-              <w:rPr>
-                <w:sz w:val="20"/>
-              </w:rPr>
-            </w:r>
-          </w:p>
-        </w:tc>
-      </w:tr>
-    </w:tbl>
-    <w:p>
-      <w:pPr>
-        <w:pStyle w:val="Heading2"/>
-        <w:keepNext/>
-      </w:pPr>
-      <w:r>
-        <w:rPr>
-          <w:b/>
-        </w:rPr>
-        <w:t>Exercise 7: Automate an order</w:t>
+        <w:t>Exercise 6: Automate an order</w:t>
       </w:r>
     </w:p>
     <w:p>

</xml_diff>

<commit_message>
Weeks 3-4 sheet: Chrome opens with new ChromeDriver(), incognito for the order
</commit_message>
<xml_diff>
--- a/week-04/Weeks 3-4 - Lab Sheet.docx
+++ b/week-04/Weeks 3-4 - Lab Sheet.docx
@@ -2351,7 +2351,7 @@
               <w:rPr>
                 <w:sz w:val="20"/>
               </w:rPr>
-              <w:t>Opens Chrome: driver = Setup.chrome();</w:t>
+              <w:t>Opens Chrome: driver = new ChromeDriver();</w:t>
             </w:r>
           </w:p>
         </w:tc>
@@ -2794,7 +2794,7 @@
               <w:rPr>
                 <w:sz w:val="20"/>
               </w:rPr>
-              <w:t>Opens Chrome: driver = Setup.chrome();</w:t>
+              <w:t>Opens Chrome in incognito (the three lines below).</w:t>
             </w:r>
           </w:p>
         </w:tc>
@@ -3119,7 +3119,71 @@
           <w:i w:val="0"/>
           <w:sz w:val="20"/>
         </w:rPr>
-        <w:t>Call Setup.pause() after every step so you can watch it work. Open Chrome with Setup.chrome(), not new ChromeDriver(): it opens Chrome in incognito, so Chrome's password warning does not stop the clicks after the login.</w:t>
+        <w:t>Open Chrome like this. Without incognito, Chrome shows a "password found in a data breach" box after the login, and every click after that does nothing:</w:t>
+      </w:r>
+    </w:p>
+    <w:p>
+      <w:pPr>
+        <w:keepNext/>
+        <w:spacing w:after="0" w:line="240" w:lineRule="auto"/>
+      </w:pPr>
+      <w:r>
+        <w:rPr>
+          <w:rFonts w:ascii="Consolas" w:hAnsi="Consolas"/>
+          <w:sz w:val="18"/>
+        </w:rPr>
+        <w:t>ChromeOptions options = new ChromeOptions();</w:t>
+      </w:r>
+    </w:p>
+    <w:p>
+      <w:pPr>
+        <w:keepNext/>
+        <w:spacing w:after="0" w:line="240" w:lineRule="auto"/>
+      </w:pPr>
+      <w:r>
+        <w:rPr>
+          <w:rFonts w:ascii="Consolas" w:hAnsi="Consolas"/>
+          <w:sz w:val="18"/>
+        </w:rPr>
+        <w:t>options.addArguments("--incognito");</w:t>
+      </w:r>
+    </w:p>
+    <w:p>
+      <w:pPr>
+        <w:keepNext/>
+        <w:spacing w:after="0" w:line="240" w:lineRule="auto"/>
+      </w:pPr>
+      <w:r>
+        <w:rPr>
+          <w:rFonts w:ascii="Consolas" w:hAnsi="Consolas"/>
+          <w:sz w:val="18"/>
+        </w:rPr>
+        <w:t>driver = new ChromeDriver(options);</w:t>
+      </w:r>
+    </w:p>
+    <w:p>
+      <w:pPr>
+        <w:keepNext/>
+      </w:pPr>
+      <w:r>
+        <w:rPr>
+          <w:b w:val="0"/>
+          <w:i w:val="0"/>
+          <w:sz w:val="20"/>
+        </w:rPr>
+      </w:r>
+    </w:p>
+    <w:p>
+      <w:pPr>
+        <w:keepNext/>
+      </w:pPr>
+      <w:r>
+        <w:rPr>
+          <w:b w:val="0"/>
+          <w:i w:val="0"/>
+          <w:sz w:val="20"/>
+        </w:rPr>
+        <w:t>Call Setup.pause() after every step so you can watch it work.</w:t>
       </w:r>
     </w:p>
     <w:tbl>

</xml_diff>